<commit_message>
build based on 0365bff
</commit_message>
<xml_diff>
--- a/dev/outputs/example.docx
+++ b/dev/outputs/example.docx
@@ -13,7 +13,9 @@
         <w:tblCellSpacing w:w="20"/>
       </w:tblPr>
       <w:tr>
-        <w:trPr/>
+        <w:trPr>
+          <w:tblHeader/>
+        </w:trPr>
         <w:tc>
           <w:tcPr>
             <w:tcBorders>
@@ -30,7 +32,9 @@
         </w:tc>
       </w:tr>
       <w:tr>
-        <w:trPr/>
+        <w:trPr>
+          <w:tblHeader/>
+        </w:trPr>
         <w:tc>
           <w:tcPr>
             <w:tcMar/>
@@ -80,7 +84,9 @@
         </w:tc>
       </w:tr>
       <w:tr>
-        <w:trPr/>
+        <w:trPr>
+          <w:tblHeader/>
+        </w:trPr>
         <w:tc>
           <w:tcPr>
             <w:tcMar/>
@@ -167,7 +173,9 @@
         </w:tc>
       </w:tr>
       <w:tr>
-        <w:trPr/>
+        <w:trPr>
+          <w:tblHeader/>
+        </w:trPr>
         <w:tc>
           <w:tcPr>
             <w:tcBorders>

</xml_diff>